<commit_message>
Add a walkthrough, and update the PDF command to it gets tripped up by unusual characters less
</commit_message>
<xml_diff>
--- a/labs/resources/new-laptop-setup-guide.docx
+++ b/labs/resources/new-laptop-setup-guide.docx
@@ -14,7 +14,7 @@
           <w:sz w:val="20"/>
           <w:szCs w:val="20"/>
         </w:rPr>
-        <w:t>NORTHWIND TECHNOLOGIES</w:t>
+        <w:t>FONTCORP TECHNOLOGIES</w:t>
       </w:r>
       <w:r>
         <w:ptab w:relativeTo="margin" w:alignment="right" w:leader="none"/>
@@ -68,7 +68,7 @@
         <w:spacing w:after="100"/>
       </w:pPr>
       <w:r>
-        <w:t>Welcome to Northwind! This guide will help you get your new laptop ready on your first day. A few steps ask you to run a short command — just press the ⊞ Windows key + R to open the Run box, copy and paste the line shown, and press Enter. Work through the steps in order. The whole process takes about 10 minutes.</w:t>
+        <w:t>Welcome to FontCorp! This guide will help you get your new laptop ready on your first day. A few steps ask you to run a short command — just press the ⊞ Windows key + R to open the Run box, copy and paste the line shown, and press Enter. Work through the steps in order. The whole process takes about 10 minutes.</w:t>
       </w:r>
     </w:p>
     <w:p>
@@ -90,7 +90,7 @@
         <w:spacing w:after="100"/>
       </w:pPr>
       <w:r>
-        <w:t>Select the network icon on the taskbar (bottom-right), choose “Northwind-Corp”, and sign in with your company username and password.</w:t>
+        <w:t>Select the network icon on the taskbar (bottom-right), choose “FontCorp-Wifi”, and sign in with your company username and password.</w:t>
       </w:r>
     </w:p>
     <w:p>
@@ -112,7 +112,7 @@
         <w:spacing w:after="100"/>
       </w:pPr>
       <w:r>
-        <w:t>If you haven’t already, sign in with your Northwind email address and the temporary password from your welcome email. You’ll be prompted to set a new password and register for multi-factor authentication.</w:t>
+        <w:t>If you haven’t already, sign in with your FontCorp email address and the temporary password from your welcome email. You’ll be prompted to set a new password and register for multi-factor authentication.</w:t>
       </w:r>
     </w:p>
     <w:p>
@@ -154,20 +154,8 @@
           <w:sz w:val="20"/>
           <w:szCs w:val="20"/>
         </w:rPr>
-        <w:t>net use S: \\northwind-fs01\shared /</w:t>
-      </w:r>
-      <w:proofErr w:type="spellStart"/>
-      <w:proofErr w:type="gramStart"/>
-      <w:r>
-        <w:rPr>
-          <w:rFonts w:ascii="Consolas" w:eastAsia="Consolas" w:hAnsi="Consolas" w:cs="Consolas"/>
-          <w:sz w:val="20"/>
-          <w:szCs w:val="20"/>
-        </w:rPr>
-        <w:t>persistent:yes</w:t>
-      </w:r>
-      <w:proofErr w:type="spellEnd"/>
-      <w:proofErr w:type="gramEnd"/>
+        <w:t>net use S: \\fontcorp-fs01\shared /persistent:yes</w:t>
+      </w:r>
     </w:p>
     <w:p>
       <w:pPr>
@@ -208,7 +196,7 @@
           <w:sz w:val="20"/>
           <w:szCs w:val="20"/>
         </w:rPr>
-        <w:t>\\northwind-print01\HQ-Floor2</w:t>
+        <w:t>\\fontcorp-print01\HQ-Floor2</w:t>
       </w:r>
     </w:p>
     <w:p>
@@ -230,15 +218,7 @@
         <w:spacing w:after="100"/>
       </w:pPr>
       <w:r>
-        <w:t xml:space="preserve">This </w:t>
-      </w:r>
-      <w:proofErr w:type="gramStart"/>
-      <w:r>
-        <w:t>applies</w:t>
-      </w:r>
-      <w:proofErr w:type="gramEnd"/>
-      <w:r>
-        <w:t xml:space="preserve"> your account permissions and company settings. Press ⊞ Win + R, paste the line below, and press Enter — a black window will open briefly and close on its own:</w:t>
+        <w:t>This applies your account permissions and company settings. Press ⊞ Win + R, paste the line below, and press Enter — a black window will open briefly and close on its own:</w:t>
       </w:r>
     </w:p>
     <w:p>
@@ -252,23 +232,13 @@
         <w:shd w:val="clear" w:color="auto" w:fill="F3F3F3"/>
         <w:spacing w:before="40" w:after="160"/>
       </w:pPr>
-      <w:proofErr w:type="spellStart"/>
       <w:r>
         <w:rPr>
           <w:rFonts w:ascii="Consolas" w:eastAsia="Consolas" w:hAnsi="Consolas" w:cs="Consolas"/>
           <w:sz w:val="20"/>
           <w:szCs w:val="20"/>
         </w:rPr>
-        <w:t>gpupdate</w:t>
-      </w:r>
-      <w:proofErr w:type="spellEnd"/>
-      <w:r>
-        <w:rPr>
-          <w:rFonts w:ascii="Consolas" w:eastAsia="Consolas" w:hAnsi="Consolas" w:cs="Consolas"/>
-          <w:sz w:val="20"/>
-          <w:szCs w:val="20"/>
-        </w:rPr>
-        <w:t xml:space="preserve"> /force</w:t>
+        <w:t>gpupdate /force</w:t>
       </w:r>
     </w:p>
     <w:p>
@@ -320,25 +290,7 @@
           <w:sz w:val="20"/>
           <w:szCs w:val="20"/>
         </w:rPr>
-        <w:t xml:space="preserve">Contact the IT Service Desk at </w:t>
-      </w:r>
-      <w:proofErr w:type="spellStart"/>
-      <w:r>
-        <w:rPr>
-          <w:color w:val="595959"/>
-          <w:sz w:val="20"/>
-          <w:szCs w:val="20"/>
-        </w:rPr>
-        <w:t>help@northwind.example</w:t>
-      </w:r>
-      <w:proofErr w:type="spellEnd"/>
-      <w:r>
-        <w:rPr>
-          <w:color w:val="595959"/>
-          <w:sz w:val="20"/>
-          <w:szCs w:val="20"/>
-        </w:rPr>
-        <w:t xml:space="preserve"> or ext. 4357 (HELP).</w:t>
+        <w:t>Contact the IT Service Desk at help@fontcorp.example or ext. 4357 (HELP).</w:t>
       </w:r>
     </w:p>
     <w:sectPr>

</xml_diff>